<commit_message>
feat(template): enhance document structure with styled headings and additional sub-chapter titles
</commit_message>
<xml_diff>
--- a/PPKI_IPB_Template.docx
+++ b/PPKI_IPB_Template.docx
@@ -219,6 +219,7 @@
     </w:p>
     <w:p>
       <w:pPr>
+        <w:pStyle w:val="Heading1"/>
         <w:spacing w:before="0" w:after="480"/>
         <w:ind w:firstLine="0"/>
         <w:jc w:val="center"/>
@@ -227,6 +228,7 @@
         <w:rPr>
           <w:rFonts w:ascii="Times New Roman" w:hAnsi="Times New Roman"/>
           <w:b/>
+          <w:color w:val="000000"/>
           <w:sz w:val="28"/>
         </w:rPr>
         <w:t>HALAMAN PERNYATAAN</w:t>
@@ -244,6 +246,7 @@
     </w:p>
     <w:p>
       <w:pPr>
+        <w:pStyle w:val="Heading1"/>
         <w:spacing w:before="0" w:after="480"/>
         <w:ind w:firstLine="0"/>
         <w:jc w:val="center"/>
@@ -252,6 +255,7 @@
         <w:rPr>
           <w:rFonts w:ascii="Times New Roman" w:hAnsi="Times New Roman"/>
           <w:b/>
+          <w:color w:val="000000"/>
           <w:sz w:val="28"/>
         </w:rPr>
         <w:t>ABSTRAK</w:t>
@@ -269,6 +273,7 @@
     </w:p>
     <w:p>
       <w:pPr>
+        <w:pStyle w:val="Heading1"/>
         <w:spacing w:before="0" w:after="480"/>
         <w:ind w:firstLine="0"/>
         <w:jc w:val="center"/>
@@ -277,6 +282,7 @@
         <w:rPr>
           <w:rFonts w:ascii="Times New Roman" w:hAnsi="Times New Roman"/>
           <w:b/>
+          <w:color w:val="000000"/>
           <w:sz w:val="28"/>
         </w:rPr>
         <w:t>ABSTRACT</w:t>
@@ -294,6 +300,7 @@
     </w:p>
     <w:p>
       <w:pPr>
+        <w:pStyle w:val="Heading1"/>
         <w:spacing w:before="0" w:after="480"/>
         <w:ind w:firstLine="0"/>
         <w:jc w:val="center"/>
@@ -302,6 +309,7 @@
         <w:rPr>
           <w:rFonts w:ascii="Times New Roman" w:hAnsi="Times New Roman"/>
           <w:b/>
+          <w:color w:val="000000"/>
           <w:sz w:val="28"/>
         </w:rPr>
         <w:t>RINGKASAN</w:t>
@@ -319,6 +327,7 @@
     </w:p>
     <w:p>
       <w:pPr>
+        <w:pStyle w:val="Heading1"/>
         <w:spacing w:before="0" w:after="480"/>
         <w:ind w:firstLine="0"/>
         <w:jc w:val="center"/>
@@ -327,6 +336,7 @@
         <w:rPr>
           <w:rFonts w:ascii="Times New Roman" w:hAnsi="Times New Roman"/>
           <w:b/>
+          <w:color w:val="000000"/>
           <w:sz w:val="28"/>
         </w:rPr>
         <w:t>PRAKATA</w:t>
@@ -344,6 +354,7 @@
     </w:p>
     <w:p>
       <w:pPr>
+        <w:pStyle w:val="Heading1"/>
         <w:spacing w:before="0" w:after="480"/>
         <w:ind w:firstLine="0"/>
         <w:jc w:val="center"/>
@@ -352,6 +363,7 @@
         <w:rPr>
           <w:rFonts w:ascii="Times New Roman" w:hAnsi="Times New Roman"/>
           <w:b/>
+          <w:color w:val="000000"/>
           <w:sz w:val="28"/>
         </w:rPr>
         <w:t>DAFTAR ISI</w:t>
@@ -369,6 +381,7 @@
     </w:p>
     <w:p>
       <w:pPr>
+        <w:pStyle w:val="Heading1"/>
         <w:spacing w:before="0" w:after="480"/>
         <w:ind w:firstLine="0"/>
         <w:jc w:val="center"/>
@@ -377,6 +390,7 @@
         <w:rPr>
           <w:rFonts w:ascii="Times New Roman" w:hAnsi="Times New Roman"/>
           <w:b/>
+          <w:color w:val="000000"/>
           <w:sz w:val="28"/>
         </w:rPr>
         <w:t>DAFTAR TABEL</w:t>
@@ -394,6 +408,7 @@
     </w:p>
     <w:p>
       <w:pPr>
+        <w:pStyle w:val="Heading1"/>
         <w:spacing w:before="0" w:after="480"/>
         <w:ind w:firstLine="0"/>
         <w:jc w:val="center"/>
@@ -402,6 +417,7 @@
         <w:rPr>
           <w:rFonts w:ascii="Times New Roman" w:hAnsi="Times New Roman"/>
           <w:b/>
+          <w:color w:val="000000"/>
           <w:sz w:val="28"/>
         </w:rPr>
         <w:t>DAFTAR GAMBAR</w:t>
@@ -419,6 +435,7 @@
     </w:p>
     <w:p>
       <w:pPr>
+        <w:pStyle w:val="Heading1"/>
         <w:spacing w:before="0" w:after="480"/>
         <w:ind w:firstLine="0"/>
         <w:jc w:val="center"/>
@@ -427,6 +444,7 @@
         <w:rPr>
           <w:rFonts w:ascii="Times New Roman" w:hAnsi="Times New Roman"/>
           <w:b/>
+          <w:color w:val="000000"/>
           <w:sz w:val="28"/>
         </w:rPr>
         <w:t>DAFTAR LAMPIRAN</w:t>
@@ -452,6 +470,7 @@
     </w:p>
     <w:p>
       <w:pPr>
+        <w:pStyle w:val="Heading1"/>
         <w:spacing w:before="0" w:after="480"/>
         <w:ind w:firstLine="0"/>
         <w:jc w:val="center"/>
@@ -460,6 +479,7 @@
         <w:rPr>
           <w:rFonts w:ascii="Times New Roman" w:hAnsi="Times New Roman"/>
           <w:b/>
+          <w:color w:val="000000"/>
           <w:sz w:val="28"/>
         </w:rPr>
         <w:t>II TINJAUAN PUSTAKA</w:t>
@@ -467,6 +487,7 @@
     </w:p>
     <w:p>
       <w:pPr>
+        <w:pStyle w:val="Heading2"/>
         <w:spacing w:before="480" w:after="240"/>
         <w:ind w:firstLine="0"/>
         <w:jc w:val="left"/>
@@ -475,6 +496,7 @@
         <w:rPr>
           <w:rFonts w:ascii="Times New Roman" w:hAnsi="Times New Roman"/>
           <w:b/>
+          <w:color w:val="000000"/>
           <w:sz w:val="24"/>
         </w:rPr>
         <w:t>2.1 Judul Subbab (Kata dalam judul diawali dengan huruf kapital dan dicetak tebal)</w:t>
@@ -531,6 +553,23 @@
       </w:pPr>
       <w:r>
         <w:t>3)  ...</w:t>
+      </w:r>
+    </w:p>
+    <w:p>
+      <w:pPr>
+        <w:pStyle w:val="Heading3"/>
+        <w:spacing w:before="360" w:after="240"/>
+        <w:ind w:firstLine="0"/>
+        <w:jc w:val="left"/>
+      </w:pPr>
+      <w:r>
+        <w:rPr>
+          <w:rFonts w:ascii="Times New Roman" w:hAnsi="Times New Roman"/>
+          <w:b w:val="0"/>
+          <w:color w:val="000000"/>
+          <w:sz w:val="24"/>
+        </w:rPr>
+        <w:t>2.1.1 Judul Sub-subbab (Kata dalam judul diawali dengan huruf kapital dan dicetak tidak tebal)</w:t>
       </w:r>
     </w:p>
     <w:p>
@@ -603,6 +642,23 @@
     </w:p>
     <w:p>
       <w:pPr>
+        <w:pStyle w:val="Heading3"/>
+        <w:spacing w:before="360" w:after="240"/>
+        <w:ind w:firstLine="0"/>
+        <w:jc w:val="left"/>
+      </w:pPr>
+      <w:r>
+        <w:rPr>
+          <w:rFonts w:ascii="Times New Roman" w:hAnsi="Times New Roman"/>
+          <w:b w:val="0"/>
+          <w:color w:val="000000"/>
+          <w:sz w:val="24"/>
+        </w:rPr>
+        <w:t>2.1.2 Judul Sub-subbab</w:t>
+      </w:r>
+    </w:p>
+    <w:p>
+      <w:pPr>
         <w:spacing w:before="360" w:after="240"/>
         <w:ind w:firstLine="0"/>
         <w:jc w:val="left"/>
@@ -618,6 +674,7 @@
     </w:p>
     <w:p>
       <w:pPr>
+        <w:pStyle w:val="Heading2"/>
         <w:spacing w:before="480" w:after="240"/>
         <w:ind w:firstLine="0"/>
         <w:jc w:val="left"/>
@@ -626,6 +683,7 @@
         <w:rPr>
           <w:rFonts w:ascii="Times New Roman" w:hAnsi="Times New Roman"/>
           <w:b/>
+          <w:color w:val="000000"/>
           <w:sz w:val="24"/>
         </w:rPr>
         <w:t>2.2 Judul Subbab</w:t>
@@ -682,6 +740,23 @@
       </w:pPr>
       <w:r>
         <w:t>3)  ...</w:t>
+      </w:r>
+    </w:p>
+    <w:p>
+      <w:pPr>
+        <w:pStyle w:val="Heading3"/>
+        <w:spacing w:before="360" w:after="240"/>
+        <w:ind w:firstLine="0"/>
+        <w:jc w:val="left"/>
+      </w:pPr>
+      <w:r>
+        <w:rPr>
+          <w:rFonts w:ascii="Times New Roman" w:hAnsi="Times New Roman"/>
+          <w:b w:val="0"/>
+          <w:color w:val="000000"/>
+          <w:sz w:val="24"/>
+        </w:rPr>
+        <w:t>2.2.1 Judul Sub-subbab</w:t>
       </w:r>
     </w:p>
     <w:p>
@@ -754,6 +829,23 @@
     </w:p>
     <w:p>
       <w:pPr>
+        <w:pStyle w:val="Heading3"/>
+        <w:spacing w:before="360" w:after="240"/>
+        <w:ind w:firstLine="0"/>
+        <w:jc w:val="left"/>
+      </w:pPr>
+      <w:r>
+        <w:rPr>
+          <w:rFonts w:ascii="Times New Roman" w:hAnsi="Times New Roman"/>
+          <w:b w:val="0"/>
+          <w:color w:val="000000"/>
+          <w:sz w:val="24"/>
+        </w:rPr>
+        <w:t>2.2.2 Judul Sub-subbab</w:t>
+      </w:r>
+    </w:p>
+    <w:p>
+      <w:pPr>
         <w:spacing w:before="360" w:after="240"/>
         <w:ind w:firstLine="0"/>
         <w:jc w:val="left"/>
@@ -765,6 +857,23 @@
           <w:sz w:val="24"/>
         </w:rPr>
         <w:t>2.2.2 Judul Sub-subbab</w:t>
+      </w:r>
+    </w:p>
+    <w:p>
+      <w:pPr>
+        <w:pStyle w:val="Heading3"/>
+        <w:spacing w:before="360" w:after="240"/>
+        <w:ind w:firstLine="0"/>
+        <w:jc w:val="left"/>
+      </w:pPr>
+      <w:r>
+        <w:rPr>
+          <w:rFonts w:ascii="Times New Roman" w:hAnsi="Times New Roman"/>
+          <w:b w:val="0"/>
+          <w:color w:val="000000"/>
+          <w:sz w:val="24"/>
+        </w:rPr>
+        <w:t>2.2.3 Judul Sub-subbab</w:t>
       </w:r>
     </w:p>
     <w:p>
@@ -815,6 +924,7 @@
     </w:p>
     <w:p>
       <w:pPr>
+        <w:pStyle w:val="Heading1"/>
         <w:spacing w:before="0" w:after="480"/>
         <w:ind w:firstLine="0"/>
         <w:jc w:val="center"/>
@@ -823,6 +933,7 @@
         <w:rPr>
           <w:rFonts w:ascii="Times New Roman" w:hAnsi="Times New Roman"/>
           <w:b/>
+          <w:color w:val="000000"/>
           <w:sz w:val="28"/>
         </w:rPr>
         <w:t>DAFTAR PUSTAKA</w:t>

</xml_diff>